<commit_message>
vpc peering task2 assignments completed
</commit_message>
<xml_diff>
--- a/Bash-Scripting/Bash Script Tasks-Assignment.docx
+++ b/Bash-Scripting/Bash Script Tasks-Assignment.docx
@@ -411,12 +411,12 @@
           <wp:inline distB="114300" distT="114300" distL="114300" distR="114300">
             <wp:extent cx="5210175" cy="4629150"/>
             <wp:effectExtent b="0" l="0" r="0" t="0"/>
-            <wp:docPr id="3" name="image6.png"/>
+            <wp:docPr id="3" name="image13.png"/>
             <a:graphic>
               <a:graphicData uri="http://schemas.openxmlformats.org/drawingml/2006/picture">
                 <pic:pic>
                   <pic:nvPicPr>
-                    <pic:cNvPr id="0" name="image6.png"/>
+                    <pic:cNvPr id="0" name="image13.png"/>
                     <pic:cNvPicPr preferRelativeResize="0"/>
                   </pic:nvPicPr>
                   <pic:blipFill>
@@ -746,12 +746,12 @@
           <wp:inline distB="114300" distT="114300" distL="114300" distR="114300">
             <wp:extent cx="5448300" cy="4391025"/>
             <wp:effectExtent b="0" l="0" r="0" t="0"/>
-            <wp:docPr id="11" name="image3.png"/>
+            <wp:docPr id="11" name="image7.png"/>
             <a:graphic>
               <a:graphicData uri="http://schemas.openxmlformats.org/drawingml/2006/picture">
                 <pic:pic>
                   <pic:nvPicPr>
-                    <pic:cNvPr id="0" name="image3.png"/>
+                    <pic:cNvPr id="0" name="image7.png"/>
                     <pic:cNvPicPr preferRelativeResize="0"/>
                   </pic:nvPicPr>
                   <pic:blipFill>
@@ -803,12 +803,12 @@
           <wp:inline distB="114300" distT="114300" distL="114300" distR="114300">
             <wp:extent cx="5153025" cy="4343400"/>
             <wp:effectExtent b="0" l="0" r="0" t="0"/>
-            <wp:docPr id="7" name="image12.png"/>
+            <wp:docPr id="7" name="image9.png"/>
             <a:graphic>
               <a:graphicData uri="http://schemas.openxmlformats.org/drawingml/2006/picture">
                 <pic:pic>
                   <pic:nvPicPr>
-                    <pic:cNvPr id="0" name="image12.png"/>
+                    <pic:cNvPr id="0" name="image9.png"/>
                     <pic:cNvPicPr preferRelativeResize="0"/>
                   </pic:nvPicPr>
                   <pic:blipFill>
@@ -1597,12 +1597,12 @@
           <wp:inline distB="114300" distT="114300" distL="114300" distR="114300">
             <wp:extent cx="5943600" cy="3416300"/>
             <wp:effectExtent b="0" l="0" r="0" t="0"/>
-            <wp:docPr id="2" name="image5.png"/>
+            <wp:docPr id="2" name="image1.png"/>
             <a:graphic>
               <a:graphicData uri="http://schemas.openxmlformats.org/drawingml/2006/picture">
                 <pic:pic>
                   <pic:nvPicPr>
-                    <pic:cNvPr id="0" name="image5.png"/>
+                    <pic:cNvPr id="0" name="image1.png"/>
                     <pic:cNvPicPr preferRelativeResize="0"/>
                   </pic:nvPicPr>
                   <pic:blipFill>
@@ -2197,12 +2197,12 @@
           <wp:inline distB="114300" distT="114300" distL="114300" distR="114300">
             <wp:extent cx="5943600" cy="2362200"/>
             <wp:effectExtent b="0" l="0" r="0" t="0"/>
-            <wp:docPr id="4" name="image13.png"/>
+            <wp:docPr id="4" name="image11.png"/>
             <a:graphic>
               <a:graphicData uri="http://schemas.openxmlformats.org/drawingml/2006/picture">
                 <pic:pic>
                   <pic:nvPicPr>
-                    <pic:cNvPr id="0" name="image13.png"/>
+                    <pic:cNvPr id="0" name="image11.png"/>
                     <pic:cNvPicPr preferRelativeResize="0"/>
                   </pic:nvPicPr>
                   <pic:blipFill>
@@ -3034,12 +3034,12 @@
           <wp:inline distB="114300" distT="114300" distL="114300" distR="114300">
             <wp:extent cx="5943600" cy="3327400"/>
             <wp:effectExtent b="0" l="0" r="0" t="0"/>
-            <wp:docPr id="13" name="image9.png"/>
+            <wp:docPr id="13" name="image4.png"/>
             <a:graphic>
               <a:graphicData uri="http://schemas.openxmlformats.org/drawingml/2006/picture">
                 <pic:pic>
                   <pic:nvPicPr>
-                    <pic:cNvPr id="0" name="image9.png"/>
+                    <pic:cNvPr id="0" name="image4.png"/>
                     <pic:cNvPicPr preferRelativeResize="0"/>
                   </pic:nvPicPr>
                   <pic:blipFill>
@@ -3534,12 +3534,12 @@
           <wp:inline distB="114300" distT="114300" distL="114300" distR="114300">
             <wp:extent cx="5448300" cy="2257425"/>
             <wp:effectExtent b="0" l="0" r="0" t="0"/>
-            <wp:docPr id="8" name="image7.png"/>
+            <wp:docPr id="8" name="image10.png"/>
             <a:graphic>
               <a:graphicData uri="http://schemas.openxmlformats.org/drawingml/2006/picture">
                 <pic:pic>
                   <pic:nvPicPr>
-                    <pic:cNvPr id="0" name="image7.png"/>
+                    <pic:cNvPr id="0" name="image10.png"/>
                     <pic:cNvPicPr preferRelativeResize="0"/>
                   </pic:nvPicPr>
                   <pic:blipFill>
@@ -4720,12 +4720,12 @@
           <wp:inline distB="114300" distT="114300" distL="114300" distR="114300">
             <wp:extent cx="5143500" cy="4772025"/>
             <wp:effectExtent b="0" l="0" r="0" t="0"/>
-            <wp:docPr id="12" name="image11.png"/>
+            <wp:docPr id="12" name="image3.png"/>
             <a:graphic>
               <a:graphicData uri="http://schemas.openxmlformats.org/drawingml/2006/picture">
                 <pic:pic>
                   <pic:nvPicPr>
-                    <pic:cNvPr id="0" name="image11.png"/>
+                    <pic:cNvPr id="0" name="image3.png"/>
                     <pic:cNvPicPr preferRelativeResize="0"/>
                   </pic:nvPicPr>
                   <pic:blipFill>
@@ -5181,12 +5181,12 @@
           <wp:inline distB="114300" distT="114300" distL="114300" distR="114300">
             <wp:extent cx="4448175" cy="866775"/>
             <wp:effectExtent b="0" l="0" r="0" t="0"/>
-            <wp:docPr id="10" name="image1.png"/>
+            <wp:docPr id="10" name="image6.png"/>
             <a:graphic>
               <a:graphicData uri="http://schemas.openxmlformats.org/drawingml/2006/picture">
                 <pic:pic>
                   <pic:nvPicPr>
-                    <pic:cNvPr id="0" name="image1.png"/>
+                    <pic:cNvPr id="0" name="image6.png"/>
                     <pic:cNvPicPr preferRelativeResize="0"/>
                   </pic:nvPicPr>
                   <pic:blipFill>
@@ -5538,12 +5538,12 @@
           <wp:inline distB="114300" distT="114300" distL="114300" distR="114300">
             <wp:extent cx="4924425" cy="3390900"/>
             <wp:effectExtent b="0" l="0" r="0" t="0"/>
-            <wp:docPr id="9" name="image2.png"/>
+            <wp:docPr id="9" name="image5.png"/>
             <a:graphic>
               <a:graphicData uri="http://schemas.openxmlformats.org/drawingml/2006/picture">
                 <pic:pic>
                   <pic:nvPicPr>
-                    <pic:cNvPr id="0" name="image2.png"/>
+                    <pic:cNvPr id="0" name="image5.png"/>
                     <pic:cNvPicPr preferRelativeResize="0"/>
                   </pic:nvPicPr>
                   <pic:blipFill>
@@ -6051,12 +6051,12 @@
           <wp:inline distB="114300" distT="114300" distL="114300" distR="114300">
             <wp:extent cx="5334000" cy="5686425"/>
             <wp:effectExtent b="0" l="0" r="0" t="0"/>
-            <wp:docPr id="1" name="image10.png"/>
+            <wp:docPr id="1" name="image12.png"/>
             <a:graphic>
               <a:graphicData uri="http://schemas.openxmlformats.org/drawingml/2006/picture">
                 <pic:pic>
                   <pic:nvPicPr>
-                    <pic:cNvPr id="0" name="image10.png"/>
+                    <pic:cNvPr id="0" name="image12.png"/>
                     <pic:cNvPicPr preferRelativeResize="0"/>
                   </pic:nvPicPr>
                   <pic:blipFill>
@@ -6440,12 +6440,12 @@
           <wp:inline distB="114300" distT="114300" distL="114300" distR="114300">
             <wp:extent cx="5543550" cy="5000625"/>
             <wp:effectExtent b="0" l="0" r="0" t="0"/>
-            <wp:docPr id="5" name="image4.png"/>
+            <wp:docPr id="5" name="image2.png"/>
             <a:graphic>
               <a:graphicData uri="http://schemas.openxmlformats.org/drawingml/2006/picture">
                 <pic:pic>
                   <pic:nvPicPr>
-                    <pic:cNvPr id="0" name="image4.png"/>
+                    <pic:cNvPr id="0" name="image2.png"/>
                     <pic:cNvPicPr preferRelativeResize="0"/>
                   </pic:nvPicPr>
                   <pic:blipFill>
@@ -9034,28 +9034,12 @@
       </w:r>
     </w:p>
     <w:sectPr>
-      <w:footerReference r:id="rId19" w:type="default"/>
       <w:pgSz w:h="15840" w:w="12240" w:orient="portrait"/>
       <w:pgMar w:bottom="1440" w:top="1440" w:left="1440" w:right="1440" w:header="720" w:footer="720"/>
       <w:pgNumType w:start="1"/>
     </w:sectPr>
   </w:body>
 </w:document>
-</file>
-
-<file path=word/footer1.xml><?xml version="1.0" encoding="utf-8"?>
-<w:ftr xmlns:mc="http://schemas.openxmlformats.org/markup-compatibility/2006" xmlns:o="urn:schemas-microsoft-com:office:office" xmlns:r="http://schemas.openxmlformats.org/officeDocument/2006/relationships" xmlns:m="http://schemas.openxmlformats.org/officeDocument/2006/math" xmlns:v="urn:schemas-microsoft-com:vml" xmlns:wp="http://schemas.openxmlformats.org/drawingml/2006/wordprocessingDrawing" xmlns:w10="urn:schemas-microsoft-com:office:word" xmlns:w="http://schemas.openxmlformats.org/wordprocessingml/2006/main" xmlns:wne="http://schemas.microsoft.com/office/word/2006/wordml" xmlns:sl="http://schemas.openxmlformats.org/schemaLibrary/2006/main" xmlns:a="http://schemas.openxmlformats.org/drawingml/2006/main" xmlns:pic="http://schemas.openxmlformats.org/drawingml/2006/picture" xmlns:c="http://schemas.openxmlformats.org/drawingml/2006/chart" xmlns:lc="http://schemas.openxmlformats.org/drawingml/2006/lockedCanvas" xmlns:dgm="http://schemas.openxmlformats.org/drawingml/2006/diagram" xmlns:wps="http://schemas.microsoft.com/office/word/2010/wordprocessingShape" xmlns:wpg="http://schemas.microsoft.com/office/word/2010/wordprocessingGroup" xmlns:w14="http://schemas.microsoft.com/office/word/2010/wordml" xmlns:w15="http://schemas.microsoft.com/office/word/2012/wordml" xmlns:w16="http://schemas.microsoft.com/office/word/2018/wordml" xmlns:w16cex="http://schemas.microsoft.com/office/word/2018/wordml/cex" xmlns:w16cid="http://schemas.microsoft.com/office/word/2016/wordml/cid" xmlns="http://schemas.microsoft.com/office/tasks/2019/documenttasks" xmlns:cr="http://schemas.microsoft.com/office/comments/2020/reactions">
-  <w:p>
-    <w:pPr>
-      <w:rPr/>
-    </w:pPr>
-    <w:r>
-      <w:rPr>
-        <w:rtl w:val="0"/>
-      </w:rPr>
-    </w:r>
-  </w:p>
-</w:ftr>
 </file>
 
 <file path=word/numbering.xml><?xml version="1.0" encoding="utf-8"?>

</xml_diff>

<commit_message>
Bash scripting assignments completed
</commit_message>
<xml_diff>
--- a/Bash-Scripting/Bash Script Tasks-Assignment.docx
+++ b/Bash-Scripting/Bash Script Tasks-Assignment.docx
@@ -411,12 +411,12 @@
           <wp:inline distB="114300" distT="114300" distL="114300" distR="114300">
             <wp:extent cx="5210175" cy="4629150"/>
             <wp:effectExtent b="0" l="0" r="0" t="0"/>
-            <wp:docPr id="3" name="image6.png"/>
+            <wp:docPr id="3" name="image13.png"/>
             <a:graphic>
               <a:graphicData uri="http://schemas.openxmlformats.org/drawingml/2006/picture">
                 <pic:pic>
                   <pic:nvPicPr>
-                    <pic:cNvPr id="0" name="image6.png"/>
+                    <pic:cNvPr id="0" name="image13.png"/>
                     <pic:cNvPicPr preferRelativeResize="0"/>
                   </pic:nvPicPr>
                   <pic:blipFill>
@@ -746,12 +746,12 @@
           <wp:inline distB="114300" distT="114300" distL="114300" distR="114300">
             <wp:extent cx="5448300" cy="4391025"/>
             <wp:effectExtent b="0" l="0" r="0" t="0"/>
-            <wp:docPr id="11" name="image3.png"/>
+            <wp:docPr id="11" name="image7.png"/>
             <a:graphic>
               <a:graphicData uri="http://schemas.openxmlformats.org/drawingml/2006/picture">
                 <pic:pic>
                   <pic:nvPicPr>
-                    <pic:cNvPr id="0" name="image3.png"/>
+                    <pic:cNvPr id="0" name="image7.png"/>
                     <pic:cNvPicPr preferRelativeResize="0"/>
                   </pic:nvPicPr>
                   <pic:blipFill>
@@ -803,12 +803,12 @@
           <wp:inline distB="114300" distT="114300" distL="114300" distR="114300">
             <wp:extent cx="5153025" cy="4343400"/>
             <wp:effectExtent b="0" l="0" r="0" t="0"/>
-            <wp:docPr id="7" name="image12.png"/>
+            <wp:docPr id="7" name="image9.png"/>
             <a:graphic>
               <a:graphicData uri="http://schemas.openxmlformats.org/drawingml/2006/picture">
                 <pic:pic>
                   <pic:nvPicPr>
-                    <pic:cNvPr id="0" name="image12.png"/>
+                    <pic:cNvPr id="0" name="image9.png"/>
                     <pic:cNvPicPr preferRelativeResize="0"/>
                   </pic:nvPicPr>
                   <pic:blipFill>
@@ -1597,12 +1597,12 @@
           <wp:inline distB="114300" distT="114300" distL="114300" distR="114300">
             <wp:extent cx="5943600" cy="3416300"/>
             <wp:effectExtent b="0" l="0" r="0" t="0"/>
-            <wp:docPr id="2" name="image5.png"/>
+            <wp:docPr id="2" name="image1.png"/>
             <a:graphic>
               <a:graphicData uri="http://schemas.openxmlformats.org/drawingml/2006/picture">
                 <pic:pic>
                   <pic:nvPicPr>
-                    <pic:cNvPr id="0" name="image5.png"/>
+                    <pic:cNvPr id="0" name="image1.png"/>
                     <pic:cNvPicPr preferRelativeResize="0"/>
                   </pic:nvPicPr>
                   <pic:blipFill>
@@ -2197,12 +2197,12 @@
           <wp:inline distB="114300" distT="114300" distL="114300" distR="114300">
             <wp:extent cx="5943600" cy="2362200"/>
             <wp:effectExtent b="0" l="0" r="0" t="0"/>
-            <wp:docPr id="4" name="image13.png"/>
+            <wp:docPr id="4" name="image11.png"/>
             <a:graphic>
               <a:graphicData uri="http://schemas.openxmlformats.org/drawingml/2006/picture">
                 <pic:pic>
                   <pic:nvPicPr>
-                    <pic:cNvPr id="0" name="image13.png"/>
+                    <pic:cNvPr id="0" name="image11.png"/>
                     <pic:cNvPicPr preferRelativeResize="0"/>
                   </pic:nvPicPr>
                   <pic:blipFill>
@@ -3034,12 +3034,12 @@
           <wp:inline distB="114300" distT="114300" distL="114300" distR="114300">
             <wp:extent cx="5943600" cy="3327400"/>
             <wp:effectExtent b="0" l="0" r="0" t="0"/>
-            <wp:docPr id="13" name="image9.png"/>
+            <wp:docPr id="13" name="image4.png"/>
             <a:graphic>
               <a:graphicData uri="http://schemas.openxmlformats.org/drawingml/2006/picture">
                 <pic:pic>
                   <pic:nvPicPr>
-                    <pic:cNvPr id="0" name="image9.png"/>
+                    <pic:cNvPr id="0" name="image4.png"/>
                     <pic:cNvPicPr preferRelativeResize="0"/>
                   </pic:nvPicPr>
                   <pic:blipFill>
@@ -3534,12 +3534,12 @@
           <wp:inline distB="114300" distT="114300" distL="114300" distR="114300">
             <wp:extent cx="5448300" cy="2257425"/>
             <wp:effectExtent b="0" l="0" r="0" t="0"/>
-            <wp:docPr id="8" name="image7.png"/>
+            <wp:docPr id="8" name="image10.png"/>
             <a:graphic>
               <a:graphicData uri="http://schemas.openxmlformats.org/drawingml/2006/picture">
                 <pic:pic>
                   <pic:nvPicPr>
-                    <pic:cNvPr id="0" name="image7.png"/>
+                    <pic:cNvPr id="0" name="image10.png"/>
                     <pic:cNvPicPr preferRelativeResize="0"/>
                   </pic:nvPicPr>
                   <pic:blipFill>
@@ -4720,12 +4720,12 @@
           <wp:inline distB="114300" distT="114300" distL="114300" distR="114300">
             <wp:extent cx="5143500" cy="4772025"/>
             <wp:effectExtent b="0" l="0" r="0" t="0"/>
-            <wp:docPr id="12" name="image11.png"/>
+            <wp:docPr id="12" name="image3.png"/>
             <a:graphic>
               <a:graphicData uri="http://schemas.openxmlformats.org/drawingml/2006/picture">
                 <pic:pic>
                   <pic:nvPicPr>
-                    <pic:cNvPr id="0" name="image11.png"/>
+                    <pic:cNvPr id="0" name="image3.png"/>
                     <pic:cNvPicPr preferRelativeResize="0"/>
                   </pic:nvPicPr>
                   <pic:blipFill>
@@ -5181,12 +5181,12 @@
           <wp:inline distB="114300" distT="114300" distL="114300" distR="114300">
             <wp:extent cx="4448175" cy="866775"/>
             <wp:effectExtent b="0" l="0" r="0" t="0"/>
-            <wp:docPr id="10" name="image1.png"/>
+            <wp:docPr id="10" name="image6.png"/>
             <a:graphic>
               <a:graphicData uri="http://schemas.openxmlformats.org/drawingml/2006/picture">
                 <pic:pic>
                   <pic:nvPicPr>
-                    <pic:cNvPr id="0" name="image1.png"/>
+                    <pic:cNvPr id="0" name="image6.png"/>
                     <pic:cNvPicPr preferRelativeResize="0"/>
                   </pic:nvPicPr>
                   <pic:blipFill>
@@ -5538,12 +5538,12 @@
           <wp:inline distB="114300" distT="114300" distL="114300" distR="114300">
             <wp:extent cx="4924425" cy="3390900"/>
             <wp:effectExtent b="0" l="0" r="0" t="0"/>
-            <wp:docPr id="9" name="image2.png"/>
+            <wp:docPr id="9" name="image5.png"/>
             <a:graphic>
               <a:graphicData uri="http://schemas.openxmlformats.org/drawingml/2006/picture">
                 <pic:pic>
                   <pic:nvPicPr>
-                    <pic:cNvPr id="0" name="image2.png"/>
+                    <pic:cNvPr id="0" name="image5.png"/>
                     <pic:cNvPicPr preferRelativeResize="0"/>
                   </pic:nvPicPr>
                   <pic:blipFill>
@@ -6051,12 +6051,12 @@
           <wp:inline distB="114300" distT="114300" distL="114300" distR="114300">
             <wp:extent cx="5334000" cy="5686425"/>
             <wp:effectExtent b="0" l="0" r="0" t="0"/>
-            <wp:docPr id="1" name="image10.png"/>
+            <wp:docPr id="1" name="image12.png"/>
             <a:graphic>
               <a:graphicData uri="http://schemas.openxmlformats.org/drawingml/2006/picture">
                 <pic:pic>
                   <pic:nvPicPr>
-                    <pic:cNvPr id="0" name="image10.png"/>
+                    <pic:cNvPr id="0" name="image12.png"/>
                     <pic:cNvPicPr preferRelativeResize="0"/>
                   </pic:nvPicPr>
                   <pic:blipFill>
@@ -6440,12 +6440,12 @@
           <wp:inline distB="114300" distT="114300" distL="114300" distR="114300">
             <wp:extent cx="5543550" cy="5000625"/>
             <wp:effectExtent b="0" l="0" r="0" t="0"/>
-            <wp:docPr id="5" name="image4.png"/>
+            <wp:docPr id="5" name="image2.png"/>
             <a:graphic>
               <a:graphicData uri="http://schemas.openxmlformats.org/drawingml/2006/picture">
                 <pic:pic>
                   <pic:nvPicPr>
-                    <pic:cNvPr id="0" name="image4.png"/>
+                    <pic:cNvPr id="0" name="image2.png"/>
                     <pic:cNvPicPr preferRelativeResize="0"/>
                   </pic:nvPicPr>
                   <pic:blipFill>
@@ -9034,28 +9034,12 @@
       </w:r>
     </w:p>
     <w:sectPr>
-      <w:footerReference r:id="rId19" w:type="default"/>
       <w:pgSz w:h="15840" w:w="12240" w:orient="portrait"/>
       <w:pgMar w:bottom="1440" w:top="1440" w:left="1440" w:right="1440" w:header="720" w:footer="720"/>
       <w:pgNumType w:start="1"/>
     </w:sectPr>
   </w:body>
 </w:document>
-</file>
-
-<file path=word/footer1.xml><?xml version="1.0" encoding="utf-8"?>
-<w:ftr xmlns:mc="http://schemas.openxmlformats.org/markup-compatibility/2006" xmlns:o="urn:schemas-microsoft-com:office:office" xmlns:r="http://schemas.openxmlformats.org/officeDocument/2006/relationships" xmlns:m="http://schemas.openxmlformats.org/officeDocument/2006/math" xmlns:v="urn:schemas-microsoft-com:vml" xmlns:wp="http://schemas.openxmlformats.org/drawingml/2006/wordprocessingDrawing" xmlns:w10="urn:schemas-microsoft-com:office:word" xmlns:w="http://schemas.openxmlformats.org/wordprocessingml/2006/main" xmlns:wne="http://schemas.microsoft.com/office/word/2006/wordml" xmlns:sl="http://schemas.openxmlformats.org/schemaLibrary/2006/main" xmlns:a="http://schemas.openxmlformats.org/drawingml/2006/main" xmlns:pic="http://schemas.openxmlformats.org/drawingml/2006/picture" xmlns:c="http://schemas.openxmlformats.org/drawingml/2006/chart" xmlns:lc="http://schemas.openxmlformats.org/drawingml/2006/lockedCanvas" xmlns:dgm="http://schemas.openxmlformats.org/drawingml/2006/diagram" xmlns:wps="http://schemas.microsoft.com/office/word/2010/wordprocessingShape" xmlns:wpg="http://schemas.microsoft.com/office/word/2010/wordprocessingGroup" xmlns:w14="http://schemas.microsoft.com/office/word/2010/wordml" xmlns:w15="http://schemas.microsoft.com/office/word/2012/wordml" xmlns:w16="http://schemas.microsoft.com/office/word/2018/wordml" xmlns:w16cex="http://schemas.microsoft.com/office/word/2018/wordml/cex" xmlns:w16cid="http://schemas.microsoft.com/office/word/2016/wordml/cid" xmlns="http://schemas.microsoft.com/office/tasks/2019/documenttasks" xmlns:cr="http://schemas.microsoft.com/office/comments/2020/reactions">
-  <w:p>
-    <w:pPr>
-      <w:rPr/>
-    </w:pPr>
-    <w:r>
-      <w:rPr>
-        <w:rtl w:val="0"/>
-      </w:rPr>
-    </w:r>
-  </w:p>
-</w:ftr>
 </file>
 
 <file path=word/numbering.xml><?xml version="1.0" encoding="utf-8"?>

</xml_diff>